<commit_message>
feat: update content rules and pedagogical structure for online classes
Enhanced content-rules.md to clarify the structure and requirements for slide presentations, emphasizing individual activities and immediate feedback in online settings. Updated layout-canonical.md to reflect changes in slide types and delivery methods, ensuring consistency across materials. Revised pedagogical-structure.md to outline new rules for activities, including the prohibition of group work and the requirement for directed activities led by the professor. Adjusted related documentation to align with these updates for improved clarity and adherence to the course framework.
</commit_message>
<xml_diff>
--- a/jurimetria/docs/plano_curso.docx
+++ b/jurimetria/docs/plano_curso.docx
@@ -330,7 +330,7 @@
                 <w:szCs w:val="20"/>
                 <w:rtl w:val="0"/>
               </w:rPr>
-              <w:t xml:space="preserve">Presencial</w:t>
+              <w:t xml:space="preserve">Online</w:t>
             </w:r>
             <w:r>
               <w:rPr>
@@ -2332,7 +2332,7 @@
                 <w:szCs w:val="20"/>
                 <w:rtl w:val="0"/>
               </w:rPr>
-              <w:t xml:space="preserve">Atividades individuais em sala (4 atividades, média aritmética)</w:t>
+              <w:t xml:space="preserve">Atividades individuais por aula (4 atividades, média aritmética)</w:t>
             </w:r>
             <w:r>
               <w:rPr>
@@ -2647,7 +2647,7 @@
           <w:szCs w:val="26"/>
           <w:rtl w:val="0"/>
         </w:rPr>
-        <w:t xml:space="preserve">Instrumento Avaliativo 1: Atividades Individuais em Sala (3,0 pontos)</w:t>
+        <w:t xml:space="preserve">Instrumento Avaliativo 1: Atividades Individuais por Aula (3,0 pontos)</w:t>
       </w:r>
       <w:r>
         <w:rPr>
@@ -2665,7 +2665,7 @@
         <w:rPr>
           <w:rtl w:val="0"/>
         </w:rPr>
-        <w:t xml:space="preserve">Ao longo da disciplina, será trabalhado o caso fictício X, Y &amp; Associados (XY&amp;A), um escritório que atua em ações de revisão e renovatória de aluguel para empresas, apresentado na Aula 1 e utilizado em todas as aulas como cenário prático. Ao final das Aulas 1, 2, 3 e 4, será proposta uma atividade individual com 2 a 3 perguntas objetivas relacionadas ao caso XY&amp;A e ao conteúdo da aula. Os alunos deverão responder e entregar a atividade até a aula seguinte, quando será corrigida e comentada pelo professor antes de iniciar o novo conteúdo. A nota deste instrumento é composta pela média aritmética simples das 4 entregas ao longo da disciplina. A Aula 5 não tem atividade para dar espaço à preparação final do trabalho em grupo.</w:t>
+        <w:t xml:space="preserve">Ao longo da disciplina, será trabalhado o caso fictício X, Y &amp; Associados (XY&amp;A), um escritório que atua em ações de revisão e renovatória de aluguel para empresas, apresentado na Aula 1 e utilizado em todas as aulas como cenário prático. Ao final das Aulas 1, 2, 3 e 4, será proposta uma atividade individual com 3 perguntas objetivas relacionadas ao caso XY&amp;A e ao conteúdo da aula. Os alunos deverão responder a todas as questões das 4 atividades e entregá-las em conjunto, junto com a apresentação do trabalho final na Aula 6. Por se tratar de aula online, as atividades em sala (quando houver) serão sempre dirigidas pelo professor: o enunciado é apresentado e a resolução é discutida nos slides seguintes. A nota deste instrumento é composta pela média aritmética simples das 4 atividades. A Aula 5 não tem atividade para dar espaço à preparação final do trabalho em grupo.</w:t>
       </w:r>
       <w:r>
         <w:rPr>
@@ -5231,7 +5231,7 @@
                 <w:szCs w:val="20"/>
                 <w:rtl w:val="0"/>
               </w:rPr>
-              <w:t xml:space="preserve">Atividade Prática 1 (entrega até a Aula 2): identificação de perguntas jurimétricas no caso XY&amp;A e esboço de 1 pergunta inicial para o trabalho final</w:t>
+              <w:t xml:space="preserve">Atividade Prática 1 (entrega junto com o trabalho final): identificação de perguntas jurimétricas no caso XY&amp;A e esboço de 1 pergunta inicial para o trabalho final</w:t>
             </w:r>
             <w:r>
               <w:rPr>
@@ -5570,7 +5570,7 @@
                 <w:szCs w:val="20"/>
                 <w:rtl w:val="0"/>
               </w:rPr>
-              <w:t xml:space="preserve">Correção comentada da Atividade 1</w:t>
+              <w:t xml:space="preserve">Introdução ao ciclo da ciência de dados aplicado ao Direito: visão geral das 6 etapas</w:t>
             </w:r>
             <w:r>
               <w:rPr>
@@ -5681,7 +5681,7 @@
                 <w:szCs w:val="20"/>
                 <w:rtl w:val="0"/>
               </w:rPr>
-              <w:t xml:space="preserve">Introdução ao ciclo da ciência de dados aplicado ao Direito: visão geral das 6 etapas</w:t>
+              <w:t xml:space="preserve">Por que pensar em ciclo importa: método reproduzível, rastreável e defensável</w:t>
             </w:r>
             <w:r>
               <w:rPr>
@@ -5792,7 +5792,7 @@
                 <w:szCs w:val="20"/>
                 <w:rtl w:val="0"/>
               </w:rPr>
-              <w:t xml:space="preserve">Por que pensar em ciclo importa: método reproduzível, rastreável e defensável</w:t>
+              <w:t xml:space="preserve">Etapa 1 — Transformar uma pergunta jurídica em uma pergunta investigável: critérios de "boa pergunta"</w:t>
             </w:r>
             <w:r>
               <w:rPr>
@@ -5838,117 +5838,6 @@
                 <w:rtl w:val="0"/>
               </w:rPr>
               <w:t xml:space="preserve">4</w:t>
-            </w:r>
-            <w:r>
-              <w:rPr>
-                <w:rtl w:val="0"/>
-              </w:rPr>
-            </w:r>
-          </w:p>
-        </w:tc>
-        <w:tc>
-          <w:tcPr>
-            <w:tcBorders>
-              <w:top w:color="bfbfbf" w:space="0" w:sz="4" w:val="single"/>
-              <w:left w:color="bfbfbf" w:space="0" w:sz="4" w:val="single"/>
-              <w:bottom w:color="bfbfbf" w:space="0" w:sz="4" w:val="single"/>
-              <w:right w:color="bfbfbf" w:space="0" w:sz="4" w:val="single"/>
-            </w:tcBorders>
-            <w:tcMar>
-              <w:top w:w="100.0" w:type="dxa"/>
-              <w:left w:w="140.0" w:type="dxa"/>
-              <w:bottom w:w="100.0" w:type="dxa"/>
-              <w:right w:w="140.0" w:type="dxa"/>
-            </w:tcMar>
-          </w:tcPr>
-          <w:p>
-            <w:pPr>
-              <w:jc w:val="left"/>
-              <w:rPr/>
-            </w:pPr>
-            <w:r>
-              <w:rPr>
-                <w:rtl w:val="0"/>
-              </w:rPr>
-            </w:r>
-          </w:p>
-        </w:tc>
-        <w:tc>
-          <w:tcPr>
-            <w:tcBorders>
-              <w:top w:color="bfbfbf" w:space="0" w:sz="4" w:val="single"/>
-              <w:left w:color="bfbfbf" w:space="0" w:sz="4" w:val="single"/>
-              <w:bottom w:color="bfbfbf" w:space="0" w:sz="4" w:val="single"/>
-              <w:right w:color="bfbfbf" w:space="0" w:sz="4" w:val="single"/>
-            </w:tcBorders>
-            <w:tcMar>
-              <w:top w:w="100.0" w:type="dxa"/>
-              <w:left w:w="140.0" w:type="dxa"/>
-              <w:bottom w:w="100.0" w:type="dxa"/>
-              <w:right w:w="140.0" w:type="dxa"/>
-            </w:tcMar>
-          </w:tcPr>
-          <w:p>
-            <w:pPr>
-              <w:jc w:val="left"/>
-              <w:rPr/>
-            </w:pPr>
-            <w:r>
-              <w:rPr>
-                <w:rFonts w:ascii="Arial" w:cs="Arial" w:eastAsia="Arial" w:hAnsi="Arial"/>
-                <w:b w:val="0"/>
-                <w:bCs w:val="0"/>
-                <w:color w:val="000000"/>
-                <w:sz w:val="20"/>
-                <w:szCs w:val="20"/>
-                <w:rtl w:val="0"/>
-              </w:rPr>
-              <w:t xml:space="preserve">Etapa 1 — Transformar uma pergunta jurídica em uma pergunta investigável: critérios de "boa pergunta"</w:t>
-            </w:r>
-            <w:r>
-              <w:rPr>
-                <w:rtl w:val="0"/>
-              </w:rPr>
-            </w:r>
-          </w:p>
-        </w:tc>
-      </w:tr>
-      <w:tr>
-        <w:trPr>
-          <w:cantSplit w:val="0"/>
-          <w:tblHeader w:val="0"/>
-        </w:trPr>
-        <w:tc>
-          <w:tcPr>
-            <w:tcBorders>
-              <w:top w:color="bfbfbf" w:space="0" w:sz="4" w:val="single"/>
-              <w:left w:color="bfbfbf" w:space="0" w:sz="4" w:val="single"/>
-              <w:bottom w:color="bfbfbf" w:space="0" w:sz="4" w:val="single"/>
-              <w:right w:color="bfbfbf" w:space="0" w:sz="4" w:val="single"/>
-            </w:tcBorders>
-            <w:tcMar>
-              <w:top w:w="100.0" w:type="dxa"/>
-              <w:left w:w="140.0" w:type="dxa"/>
-              <w:bottom w:w="100.0" w:type="dxa"/>
-              <w:right w:w="140.0" w:type="dxa"/>
-            </w:tcMar>
-          </w:tcPr>
-          <w:p>
-            <w:pPr>
-              <w:jc w:val="center"/>
-              <w:rPr/>
-            </w:pPr>
-            <w:r>
-              <w:rPr>
-                <w:rFonts w:ascii="Arial" w:cs="Arial" w:eastAsia="Arial" w:hAnsi="Arial"/>
-                <w:b w:val="0"/>
-                <w:bCs w:val="0"/>
-                <w:color w:val="000000"/>
-                <w:sz w:val="20"/>
-                <w:szCs w:val="20"/>
-                <w:rtl w:val="0"/>
-              </w:rPr>
-              <w:t xml:space="preserve">5</w:t>
             </w:r>
             <w:r>
               <w:rPr>
@@ -6067,7 +5956,7 @@
                 <w:szCs w:val="20"/>
                 <w:rtl w:val="0"/>
               </w:rPr>
-              <w:t xml:space="preserve">6</w:t>
+              <w:t xml:space="preserve">5</w:t>
             </w:r>
             <w:r>
               <w:rPr>
@@ -6178,7 +6067,7 @@
                 <w:szCs w:val="20"/>
                 <w:rtl w:val="0"/>
               </w:rPr>
-              <w:t xml:space="preserve">7</w:t>
+              <w:t xml:space="preserve">6</w:t>
             </w:r>
             <w:r>
               <w:rPr>
@@ -6289,7 +6178,7 @@
                 <w:szCs w:val="20"/>
                 <w:rtl w:val="0"/>
               </w:rPr>
-              <w:t xml:space="preserve">8</w:t>
+              <w:t xml:space="preserve">7</w:t>
             </w:r>
             <w:r>
               <w:rPr>
@@ -7777,7 +7666,7 @@
                 <w:szCs w:val="20"/>
                 <w:rtl w:val="0"/>
               </w:rPr>
-              <w:t xml:space="preserve">Atividade Prática 2 (entrega até a Aula 3): planejar as etapas 1 a 3 do ciclo para uma pergunta a ser explorada no trabalho final</w:t>
+              <w:t xml:space="preserve">Atividade Prática 2 (entrega junto com o trabalho final): planejar as etapas 1 a 3 do ciclo para uma pergunta a ser explorada no trabalho final</w:t>
             </w:r>
           </w:p>
         </w:tc>
@@ -8123,7 +8012,7 @@
                 <w:szCs w:val="20"/>
                 <w:rtl w:val="0"/>
               </w:rPr>
-              <w:t xml:space="preserve">Correção comentada da Atividade 2</w:t>
+              <w:t xml:space="preserve">Etapa 4 — Tratar e estruturar a base de dados analítica: limpeza, padronização, criação de variáveis</w:t>
             </w:r>
             <w:r>
               <w:rPr>
@@ -8234,7 +8123,7 @@
                 <w:szCs w:val="20"/>
                 <w:rtl w:val="0"/>
               </w:rPr>
-              <w:t xml:space="preserve">Etapa 4 — Tratar e estruturar a base de dados analítica: limpeza, padronização, criação de variáveis</w:t>
+              <w:t xml:space="preserve">Excel como ferramenta de tratamento: filtros, fórmulas básicas, tabelas dinâmicas</w:t>
             </w:r>
             <w:r>
               <w:rPr>
@@ -8345,7 +8234,7 @@
                 <w:szCs w:val="20"/>
                 <w:rtl w:val="0"/>
               </w:rPr>
-              <w:t xml:space="preserve">Excel como ferramenta de tratamento: filtros, fórmulas básicas, tabelas dinâmicas</w:t>
+              <w:t xml:space="preserve">Demonstração: tratando a base de locação (datas, valores, classificação de desfecho, tipo de ação)</w:t>
             </w:r>
             <w:r>
               <w:rPr>
@@ -8456,7 +8345,7 @@
                 <w:szCs w:val="20"/>
                 <w:rtl w:val="0"/>
               </w:rPr>
-              <w:t xml:space="preserve">Demonstração: tratando a base de locação (datas, valores, classificação de desfecho, tipo de ação)</w:t>
+              <w:t xml:space="preserve">Erros comuns e armadilhas no tratamento de dados jurídicos (formatos de data, valores monetários, texto inconsistente)</w:t>
             </w:r>
             <w:r>
               <w:rPr>
@@ -8567,7 +8456,7 @@
                 <w:szCs w:val="20"/>
                 <w:rtl w:val="0"/>
               </w:rPr>
-              <w:t xml:space="preserve">Erros comuns e armadilhas no tratamento de dados jurídicos (formatos de data, valores monetários, texto inconsistente)</w:t>
+              <w:t xml:space="preserve">Etapa 5 — Análise: estatística descritiva aplicada</w:t>
             </w:r>
             <w:r>
               <w:rPr>
@@ -8678,7 +8567,7 @@
                 <w:szCs w:val="20"/>
                 <w:rtl w:val="0"/>
               </w:rPr>
-              <w:t xml:space="preserve">Etapa 5 — Análise: estatística descritiva aplicada</w:t>
+              <w:t xml:space="preserve">Medidas de posição (média, mediana, moda, percentis) e de dispersão (desvio-padrão, quartis, amplitude)</w:t>
             </w:r>
             <w:r>
               <w:rPr>
@@ -8724,117 +8613,6 @@
                 <w:rtl w:val="0"/>
               </w:rPr>
               <w:t xml:space="preserve">7</w:t>
-            </w:r>
-            <w:r>
-              <w:rPr>
-                <w:rtl w:val="0"/>
-              </w:rPr>
-            </w:r>
-          </w:p>
-        </w:tc>
-        <w:tc>
-          <w:tcPr>
-            <w:tcBorders>
-              <w:top w:color="bfbfbf" w:space="0" w:sz="4" w:val="single"/>
-              <w:left w:color="bfbfbf" w:space="0" w:sz="4" w:val="single"/>
-              <w:bottom w:color="bfbfbf" w:space="0" w:sz="4" w:val="single"/>
-              <w:right w:color="bfbfbf" w:space="0" w:sz="4" w:val="single"/>
-            </w:tcBorders>
-            <w:tcMar>
-              <w:top w:w="100.0" w:type="dxa"/>
-              <w:left w:w="140.0" w:type="dxa"/>
-              <w:bottom w:w="100.0" w:type="dxa"/>
-              <w:right w:w="140.0" w:type="dxa"/>
-            </w:tcMar>
-          </w:tcPr>
-          <w:p>
-            <w:pPr>
-              <w:jc w:val="left"/>
-              <w:rPr/>
-            </w:pPr>
-            <w:r>
-              <w:rPr>
-                <w:rtl w:val="0"/>
-              </w:rPr>
-            </w:r>
-          </w:p>
-        </w:tc>
-        <w:tc>
-          <w:tcPr>
-            <w:tcBorders>
-              <w:top w:color="bfbfbf" w:space="0" w:sz="4" w:val="single"/>
-              <w:left w:color="bfbfbf" w:space="0" w:sz="4" w:val="single"/>
-              <w:bottom w:color="bfbfbf" w:space="0" w:sz="4" w:val="single"/>
-              <w:right w:color="bfbfbf" w:space="0" w:sz="4" w:val="single"/>
-            </w:tcBorders>
-            <w:tcMar>
-              <w:top w:w="100.0" w:type="dxa"/>
-              <w:left w:w="140.0" w:type="dxa"/>
-              <w:bottom w:w="100.0" w:type="dxa"/>
-              <w:right w:w="140.0" w:type="dxa"/>
-            </w:tcMar>
-          </w:tcPr>
-          <w:p>
-            <w:pPr>
-              <w:jc w:val="left"/>
-              <w:rPr/>
-            </w:pPr>
-            <w:r>
-              <w:rPr>
-                <w:rFonts w:ascii="Arial" w:cs="Arial" w:eastAsia="Arial" w:hAnsi="Arial"/>
-                <w:b w:val="0"/>
-                <w:bCs w:val="0"/>
-                <w:color w:val="000000"/>
-                <w:sz w:val="20"/>
-                <w:szCs w:val="20"/>
-                <w:rtl w:val="0"/>
-              </w:rPr>
-              <w:t xml:space="preserve">Medidas de posição (média, mediana, moda, percentis) e de dispersão (desvio-padrão, quartis, amplitude)</w:t>
-            </w:r>
-            <w:r>
-              <w:rPr>
-                <w:rtl w:val="0"/>
-              </w:rPr>
-            </w:r>
-          </w:p>
-        </w:tc>
-      </w:tr>
-      <w:tr>
-        <w:trPr>
-          <w:cantSplit w:val="0"/>
-          <w:tblHeader w:val="0"/>
-        </w:trPr>
-        <w:tc>
-          <w:tcPr>
-            <w:tcBorders>
-              <w:top w:color="bfbfbf" w:space="0" w:sz="4" w:val="single"/>
-              <w:left w:color="bfbfbf" w:space="0" w:sz="4" w:val="single"/>
-              <w:bottom w:color="bfbfbf" w:space="0" w:sz="4" w:val="single"/>
-              <w:right w:color="bfbfbf" w:space="0" w:sz="4" w:val="single"/>
-            </w:tcBorders>
-            <w:tcMar>
-              <w:top w:w="100.0" w:type="dxa"/>
-              <w:left w:w="140.0" w:type="dxa"/>
-              <w:bottom w:w="100.0" w:type="dxa"/>
-              <w:right w:w="140.0" w:type="dxa"/>
-            </w:tcMar>
-          </w:tcPr>
-          <w:p>
-            <w:pPr>
-              <w:jc w:val="center"/>
-              <w:rPr/>
-            </w:pPr>
-            <w:r>
-              <w:rPr>
-                <w:rFonts w:ascii="Arial" w:cs="Arial" w:eastAsia="Arial" w:hAnsi="Arial"/>
-                <w:b w:val="0"/>
-                <w:bCs w:val="0"/>
-                <w:color w:val="000000"/>
-                <w:sz w:val="20"/>
-                <w:szCs w:val="20"/>
-                <w:rtl w:val="0"/>
-              </w:rPr>
-              <w:t xml:space="preserve">8</w:t>
             </w:r>
             <w:r>
               <w:rPr>
@@ -10026,7 +9804,7 @@
                 <w:szCs w:val="20"/>
                 <w:rtl w:val="0"/>
               </w:rPr>
-              <w:t xml:space="preserve">Atividade Prática 3 (entrega até a Aula 4): aplicar as etapas 4 a 6 do ciclo a uma pergunta simples sobre a base de locação</w:t>
+              <w:t xml:space="preserve">Atividade Prática 3 (entrega junto com o trabalho final): aplicar as etapas 4 a 6 do ciclo a uma pergunta simples sobre a base de locação</w:t>
             </w:r>
             <w:r>
               <w:rPr>
@@ -10380,7 +10158,15 @@
                 <w:szCs w:val="20"/>
                 <w:rtl w:val="0"/>
               </w:rPr>
-              <w:t xml:space="preserve">Correção comentada da Atividade 3</w:t>
+              <w:t xml:space="preserve">A lógica dos testes de hipóteses para advogados: analogia com o ônus da prova. Exerc</w:t>
+            </w:r>
+            <w:r>
+              <w:rPr>
+                <w:sz w:val="20"/>
+                <w:szCs w:val="20"/>
+                <w:rtl w:val="0"/>
+              </w:rPr>
+              <w:t xml:space="preserve">ício da moeda (10 lançamentos x 1.000 lançamentos para testar hipótese de viés. Proporção de “cara” = 60%. Em um caso rejeita H0 e no outro não. Introdução ao p valor e intervalo de confiança)</w:t>
             </w:r>
             <w:r>
               <w:rPr>
@@ -10491,15 +10277,7 @@
                 <w:szCs w:val="20"/>
                 <w:rtl w:val="0"/>
               </w:rPr>
-              <w:t xml:space="preserve">A lógica dos testes de hipóteses para advogados: analogia com o ônus da prova. Exerc</w:t>
-            </w:r>
-            <w:r>
-              <w:rPr>
-                <w:sz w:val="20"/>
-                <w:szCs w:val="20"/>
-                <w:rtl w:val="0"/>
-              </w:rPr>
-              <w:t xml:space="preserve">ício da moeda (10 lançamentos x 1.000 lançamentos para testar hipótese de viés. Proporção de “cara” = 60%. Em um caso rejeita H0 e no outro não. Introdução ao p valor e intervalo de confiança)</w:t>
+              <w:t xml:space="preserve">P-valor e significância estatística: o que é, o que não é, o que o advogado deve extrair disso</w:t>
             </w:r>
             <w:r>
               <w:rPr>
@@ -10610,7 +10388,7 @@
                 <w:szCs w:val="20"/>
                 <w:rtl w:val="0"/>
               </w:rPr>
-              <w:t xml:space="preserve">P-valor e significância estatística: o que é, o que não é, o que o advogado deve extrair disso</w:t>
+              <w:t xml:space="preserve">Teste qui-quadrado: há associação entre vara e resultado? (demonstração prática)</w:t>
             </w:r>
             <w:r>
               <w:rPr>
@@ -10721,7 +10499,7 @@
                 <w:szCs w:val="20"/>
                 <w:rtl w:val="0"/>
               </w:rPr>
-              <w:t xml:space="preserve">Teste qui-quadrado: há associação entre vara e resultado? (demonstração prática)</w:t>
+              <w:t xml:space="preserve">Comparação de médias: quando duas varas julgam de fato diferente?</w:t>
             </w:r>
             <w:r>
               <w:rPr>
@@ -10767,117 +10545,6 @@
                 <w:rtl w:val="0"/>
               </w:rPr>
               <w:t xml:space="preserve">5</w:t>
-            </w:r>
-            <w:r>
-              <w:rPr>
-                <w:rtl w:val="0"/>
-              </w:rPr>
-            </w:r>
-          </w:p>
-        </w:tc>
-        <w:tc>
-          <w:tcPr>
-            <w:tcBorders>
-              <w:top w:color="bfbfbf" w:space="0" w:sz="4" w:val="single"/>
-              <w:left w:color="bfbfbf" w:space="0" w:sz="4" w:val="single"/>
-              <w:bottom w:color="bfbfbf" w:space="0" w:sz="4" w:val="single"/>
-              <w:right w:color="bfbfbf" w:space="0" w:sz="4" w:val="single"/>
-            </w:tcBorders>
-            <w:tcMar>
-              <w:top w:w="100.0" w:type="dxa"/>
-              <w:left w:w="140.0" w:type="dxa"/>
-              <w:bottom w:w="100.0" w:type="dxa"/>
-              <w:right w:w="140.0" w:type="dxa"/>
-            </w:tcMar>
-          </w:tcPr>
-          <w:p>
-            <w:pPr>
-              <w:jc w:val="left"/>
-              <w:rPr/>
-            </w:pPr>
-            <w:r>
-              <w:rPr>
-                <w:rtl w:val="0"/>
-              </w:rPr>
-            </w:r>
-          </w:p>
-        </w:tc>
-        <w:tc>
-          <w:tcPr>
-            <w:tcBorders>
-              <w:top w:color="bfbfbf" w:space="0" w:sz="4" w:val="single"/>
-              <w:left w:color="bfbfbf" w:space="0" w:sz="4" w:val="single"/>
-              <w:bottom w:color="bfbfbf" w:space="0" w:sz="4" w:val="single"/>
-              <w:right w:color="bfbfbf" w:space="0" w:sz="4" w:val="single"/>
-            </w:tcBorders>
-            <w:tcMar>
-              <w:top w:w="100.0" w:type="dxa"/>
-              <w:left w:w="140.0" w:type="dxa"/>
-              <w:bottom w:w="100.0" w:type="dxa"/>
-              <w:right w:w="140.0" w:type="dxa"/>
-            </w:tcMar>
-          </w:tcPr>
-          <w:p>
-            <w:pPr>
-              <w:jc w:val="left"/>
-              <w:rPr/>
-            </w:pPr>
-            <w:r>
-              <w:rPr>
-                <w:rFonts w:ascii="Arial" w:cs="Arial" w:eastAsia="Arial" w:hAnsi="Arial"/>
-                <w:b w:val="0"/>
-                <w:bCs w:val="0"/>
-                <w:color w:val="000000"/>
-                <w:sz w:val="20"/>
-                <w:szCs w:val="20"/>
-                <w:rtl w:val="0"/>
-              </w:rPr>
-              <w:t xml:space="preserve">Comparação de médias: quando duas varas julgam de fato diferente?</w:t>
-            </w:r>
-            <w:r>
-              <w:rPr>
-                <w:rtl w:val="0"/>
-              </w:rPr>
-            </w:r>
-          </w:p>
-        </w:tc>
-      </w:tr>
-      <w:tr>
-        <w:trPr>
-          <w:cantSplit w:val="0"/>
-          <w:tblHeader w:val="0"/>
-        </w:trPr>
-        <w:tc>
-          <w:tcPr>
-            <w:tcBorders>
-              <w:top w:color="bfbfbf" w:space="0" w:sz="4" w:val="single"/>
-              <w:left w:color="bfbfbf" w:space="0" w:sz="4" w:val="single"/>
-              <w:bottom w:color="bfbfbf" w:space="0" w:sz="4" w:val="single"/>
-              <w:right w:color="bfbfbf" w:space="0" w:sz="4" w:val="single"/>
-            </w:tcBorders>
-            <w:tcMar>
-              <w:top w:w="100.0" w:type="dxa"/>
-              <w:left w:w="140.0" w:type="dxa"/>
-              <w:bottom w:w="100.0" w:type="dxa"/>
-              <w:right w:w="140.0" w:type="dxa"/>
-            </w:tcMar>
-          </w:tcPr>
-          <w:p>
-            <w:pPr>
-              <w:jc w:val="center"/>
-              <w:rPr/>
-            </w:pPr>
-            <w:r>
-              <w:rPr>
-                <w:rFonts w:ascii="Arial" w:cs="Arial" w:eastAsia="Arial" w:hAnsi="Arial"/>
-                <w:b w:val="0"/>
-                <w:bCs w:val="0"/>
-                <w:color w:val="000000"/>
-                <w:sz w:val="20"/>
-                <w:szCs w:val="20"/>
-                <w:rtl w:val="0"/>
-              </w:rPr>
-              <w:t xml:space="preserve">6</w:t>
             </w:r>
             <w:r>
               <w:rPr>
@@ -10996,7 +10663,7 @@
                 <w:szCs w:val="20"/>
                 <w:rtl w:val="0"/>
               </w:rPr>
-              <w:t xml:space="preserve">7</w:t>
+              <w:t xml:space="preserve">6</w:t>
             </w:r>
             <w:r>
               <w:rPr>
@@ -11107,7 +10774,7 @@
                 <w:szCs w:val="20"/>
                 <w:rtl w:val="0"/>
               </w:rPr>
-              <w:t xml:space="preserve">8</w:t>
+              <w:t xml:space="preserve">7</w:t>
             </w:r>
             <w:r>
               <w:rPr>
@@ -12490,7 +12157,7 @@
                 <w:szCs w:val="20"/>
                 <w:rtl w:val="0"/>
               </w:rPr>
-              <w:t xml:space="preserve">Atividade Prática 4 (entrega até a Aula 5): interpretar resultados dos 4 modelos em um cenário do XY&amp;A e recomendar uma decisão</w:t>
+              <w:t xml:space="preserve">Atividade Prática 4 (entrega junto com o trabalho final): interpretar resultados dos 4 modelos em um cenário do XY&amp;A e recomendar uma decisão</w:t>
             </w:r>
             <w:r>
               <w:rPr>
@@ -12841,7 +12508,27 @@
                 <w:szCs w:val="20"/>
                 <w:rtl w:val="0"/>
               </w:rPr>
-              <w:t xml:space="preserve">Correção comentada da Atividade 4</w:t>
+              <w:t xml:space="preserve">Por que a IA mudou o jogo para o advogado jurimetrista</w:t>
+            </w:r>
+            <w:r>
+              <w:rPr>
+                <w:sz w:val="20"/>
+                <w:szCs w:val="20"/>
+                <w:rtl w:val="0"/>
+              </w:rPr>
+              <w:t xml:space="preserve">,</w:t>
+            </w:r>
+            <w:r>
+              <w:rPr>
+                <w:rFonts w:ascii="Arial" w:cs="Arial" w:eastAsia="Arial" w:hAnsi="Arial"/>
+                <w:b w:val="0"/>
+                <w:bCs w:val="0"/>
+                <w:color w:val="000000"/>
+                <w:sz w:val="20"/>
+                <w:szCs w:val="20"/>
+                <w:rtl w:val="0"/>
+              </w:rPr>
+              <w:t xml:space="preserve"> e o que continua sendo insubstituível no humano</w:t>
             </w:r>
             <w:r>
               <w:rPr>
@@ -12952,27 +12639,7 @@
                 <w:szCs w:val="20"/>
                 <w:rtl w:val="0"/>
               </w:rPr>
-              <w:t xml:space="preserve">Por que a IA mudou o jogo para o advogado jurimetrista</w:t>
-            </w:r>
-            <w:r>
-              <w:rPr>
-                <w:sz w:val="20"/>
-                <w:szCs w:val="20"/>
-                <w:rtl w:val="0"/>
-              </w:rPr>
-              <w:t xml:space="preserve">,</w:t>
-            </w:r>
-            <w:r>
-              <w:rPr>
-                <w:rFonts w:ascii="Arial" w:cs="Arial" w:eastAsia="Arial" w:hAnsi="Arial"/>
-                <w:b w:val="0"/>
-                <w:bCs w:val="0"/>
-                <w:color w:val="000000"/>
-                <w:sz w:val="20"/>
-                <w:szCs w:val="20"/>
-                <w:rtl w:val="0"/>
-              </w:rPr>
-              <w:t xml:space="preserve"> e o que continua sendo insubstituível no humano</w:t>
+              <w:t xml:space="preserve">Revisitando o ciclo da ciência de dados: das 6 etapas em modo raiz (Aulas 2 e 3) para o modo com IA</w:t>
             </w:r>
             <w:r>
               <w:rPr>
@@ -13005,9 +12672,6 @@
           <w:p>
             <w:pPr>
               <w:jc w:val="center"/>
-              <w:rPr/>
-            </w:pPr>
-            <w:r>
               <w:rPr>
                 <w:rFonts w:ascii="Arial" w:cs="Arial" w:eastAsia="Arial" w:hAnsi="Arial"/>
                 <w:b w:val="0"/>
@@ -13015,6 +12679,12 @@
                 <w:color w:val="000000"/>
                 <w:sz w:val="20"/>
                 <w:szCs w:val="20"/>
+              </w:rPr>
+            </w:pPr>
+            <w:r>
+              <w:rPr>
+                <w:sz w:val="20"/>
+                <w:szCs w:val="20"/>
                 <w:rtl w:val="0"/>
               </w:rPr>
               <w:t xml:space="preserve">3</w:t>
@@ -13071,9 +12741,6 @@
           <w:p>
             <w:pPr>
               <w:jc w:val="left"/>
-              <w:rPr/>
-            </w:pPr>
-            <w:r>
               <w:rPr>
                 <w:rFonts w:ascii="Arial" w:cs="Arial" w:eastAsia="Arial" w:hAnsi="Arial"/>
                 <w:b w:val="0"/>
@@ -13081,9 +12748,15 @@
                 <w:color w:val="000000"/>
                 <w:sz w:val="20"/>
                 <w:szCs w:val="20"/>
-                <w:rtl w:val="0"/>
-              </w:rPr>
-              <w:t xml:space="preserve">Revisitando o ciclo da ciência de dados: das 6 etapas em modo raiz (Aulas 2 e 3) para o modo com IA</w:t>
+              </w:rPr>
+            </w:pPr>
+            <w:r>
+              <w:rPr>
+                <w:sz w:val="20"/>
+                <w:szCs w:val="20"/>
+                <w:rtl w:val="0"/>
+              </w:rPr>
+              <w:t xml:space="preserve">Antes: Engenharia de prompt. Um prompt bom formulado precisa conter 5 elementos: Contexto, Role, Task delimitation, Chain ou though e, quando aplicável, few-shot.</w:t>
             </w:r>
             <w:r>
               <w:rPr>
@@ -13116,6 +12789,71 @@
           <w:p>
             <w:pPr>
               <w:jc w:val="center"/>
+              <w:rPr/>
+            </w:pPr>
+            <w:r>
+              <w:rPr>
+                <w:sz w:val="20"/>
+                <w:szCs w:val="20"/>
+                <w:rtl w:val="0"/>
+              </w:rPr>
+              <w:t xml:space="preserve">4</w:t>
+            </w:r>
+            <w:r>
+              <w:rPr>
+                <w:rtl w:val="0"/>
+              </w:rPr>
+            </w:r>
+          </w:p>
+        </w:tc>
+        <w:tc>
+          <w:tcPr>
+            <w:tcBorders>
+              <w:top w:color="bfbfbf" w:space="0" w:sz="4" w:val="single"/>
+              <w:left w:color="bfbfbf" w:space="0" w:sz="4" w:val="single"/>
+              <w:bottom w:color="bfbfbf" w:space="0" w:sz="4" w:val="single"/>
+              <w:right w:color="bfbfbf" w:space="0" w:sz="4" w:val="single"/>
+            </w:tcBorders>
+            <w:tcMar>
+              <w:top w:w="100.0" w:type="dxa"/>
+              <w:left w:w="140.0" w:type="dxa"/>
+              <w:bottom w:w="100.0" w:type="dxa"/>
+              <w:right w:w="140.0" w:type="dxa"/>
+            </w:tcMar>
+          </w:tcPr>
+          <w:p>
+            <w:pPr>
+              <w:jc w:val="left"/>
+              <w:rPr/>
+            </w:pPr>
+            <w:r>
+              <w:rPr>
+                <w:rtl w:val="0"/>
+              </w:rPr>
+            </w:r>
+          </w:p>
+        </w:tc>
+        <w:tc>
+          <w:tcPr>
+            <w:tcBorders>
+              <w:top w:color="bfbfbf" w:space="0" w:sz="4" w:val="single"/>
+              <w:left w:color="bfbfbf" w:space="0" w:sz="4" w:val="single"/>
+              <w:bottom w:color="bfbfbf" w:space="0" w:sz="4" w:val="single"/>
+              <w:right w:color="bfbfbf" w:space="0" w:sz="4" w:val="single"/>
+            </w:tcBorders>
+            <w:tcMar>
+              <w:top w:w="100.0" w:type="dxa"/>
+              <w:left w:w="140.0" w:type="dxa"/>
+              <w:bottom w:w="100.0" w:type="dxa"/>
+              <w:right w:w="140.0" w:type="dxa"/>
+            </w:tcMar>
+          </w:tcPr>
+          <w:p>
+            <w:pPr>
+              <w:jc w:val="left"/>
+              <w:rPr/>
+            </w:pPr>
+            <w:r>
               <w:rPr>
                 <w:rFonts w:ascii="Arial" w:cs="Arial" w:eastAsia="Arial" w:hAnsi="Arial"/>
                 <w:b w:val="0"/>
@@ -13123,84 +12861,9 @@
                 <w:color w:val="000000"/>
                 <w:sz w:val="20"/>
                 <w:szCs w:val="20"/>
-              </w:rPr>
-            </w:pPr>
-            <w:r>
-              <w:rPr>
-                <w:sz w:val="20"/>
-                <w:szCs w:val="20"/>
-                <w:rtl w:val="0"/>
-              </w:rPr>
-              <w:t xml:space="preserve">4</w:t>
-            </w:r>
-            <w:r>
-              <w:rPr>
-                <w:rtl w:val="0"/>
-              </w:rPr>
-            </w:r>
-          </w:p>
-        </w:tc>
-        <w:tc>
-          <w:tcPr>
-            <w:tcBorders>
-              <w:top w:color="bfbfbf" w:space="0" w:sz="4" w:val="single"/>
-              <w:left w:color="bfbfbf" w:space="0" w:sz="4" w:val="single"/>
-              <w:bottom w:color="bfbfbf" w:space="0" w:sz="4" w:val="single"/>
-              <w:right w:color="bfbfbf" w:space="0" w:sz="4" w:val="single"/>
-            </w:tcBorders>
-            <w:tcMar>
-              <w:top w:w="100.0" w:type="dxa"/>
-              <w:left w:w="140.0" w:type="dxa"/>
-              <w:bottom w:w="100.0" w:type="dxa"/>
-              <w:right w:w="140.0" w:type="dxa"/>
-            </w:tcMar>
-          </w:tcPr>
-          <w:p>
-            <w:pPr>
-              <w:jc w:val="left"/>
-              <w:rPr/>
-            </w:pPr>
-            <w:r>
-              <w:rPr>
-                <w:rtl w:val="0"/>
-              </w:rPr>
-            </w:r>
-          </w:p>
-        </w:tc>
-        <w:tc>
-          <w:tcPr>
-            <w:tcBorders>
-              <w:top w:color="bfbfbf" w:space="0" w:sz="4" w:val="single"/>
-              <w:left w:color="bfbfbf" w:space="0" w:sz="4" w:val="single"/>
-              <w:bottom w:color="bfbfbf" w:space="0" w:sz="4" w:val="single"/>
-              <w:right w:color="bfbfbf" w:space="0" w:sz="4" w:val="single"/>
-            </w:tcBorders>
-            <w:tcMar>
-              <w:top w:w="100.0" w:type="dxa"/>
-              <w:left w:w="140.0" w:type="dxa"/>
-              <w:bottom w:w="100.0" w:type="dxa"/>
-              <w:right w:w="140.0" w:type="dxa"/>
-            </w:tcMar>
-          </w:tcPr>
-          <w:p>
-            <w:pPr>
-              <w:jc w:val="left"/>
-              <w:rPr>
-                <w:rFonts w:ascii="Arial" w:cs="Arial" w:eastAsia="Arial" w:hAnsi="Arial"/>
-                <w:b w:val="0"/>
-                <w:bCs w:val="0"/>
-                <w:color w:val="000000"/>
-                <w:sz w:val="20"/>
-                <w:szCs w:val="20"/>
-              </w:rPr>
-            </w:pPr>
-            <w:r>
-              <w:rPr>
-                <w:sz w:val="20"/>
-                <w:szCs w:val="20"/>
-                <w:rtl w:val="0"/>
-              </w:rPr>
-              <w:t xml:space="preserve">Antes: Engenharia de prompt. Um prompt bom formulado precisa conter 5 elementos: Contexto, Role, Task delimitation, Chain ou though e, quando aplicável, few-shot.</w:t>
+                <w:rtl w:val="0"/>
+              </w:rPr>
+              <w:t xml:space="preserve">Etapa 1 com IA — Transformar pergunta jurídica em pergunta investigável usando chat (ChatGPT/Claude)</w:t>
             </w:r>
             <w:r>
               <w:rPr>
@@ -13307,7 +12970,7 @@
                 <w:szCs w:val="20"/>
                 <w:rtl w:val="0"/>
               </w:rPr>
-              <w:t xml:space="preserve">Etapa 1 com IA — Transformar pergunta jurídica em pergunta investigável usando chat (ChatGPT/Claude)</w:t>
+              <w:t xml:space="preserve">Demonstração: pergunta vaga vira pergunta investigável em minutos, com iteração crítica</w:t>
             </w:r>
             <w:r>
               <w:rPr>
@@ -13414,7 +13077,7 @@
                 <w:szCs w:val="20"/>
                 <w:rtl w:val="0"/>
               </w:rPr>
-              <w:t xml:space="preserve">Demonstração: pergunta vaga vira pergunta investigável em minutos, com iteração crítica</w:t>
+              <w:t xml:space="preserve">Etapa 2 com IA — Mapeamento de informações necessárias como brainstorm estruturado (ainda dependente de análise jurídica humana)</w:t>
             </w:r>
             <w:r>
               <w:rPr>
@@ -13521,7 +13184,27 @@
                 <w:szCs w:val="20"/>
                 <w:rtl w:val="0"/>
               </w:rPr>
-              <w:t xml:space="preserve">Etapa 2 com IA — Mapeamento de informações necessárias como brainstorm estruturado (ainda dependente de análise jurídica humana)</w:t>
+              <w:t xml:space="preserve">Etapa 3 com IA — </w:t>
+            </w:r>
+            <w:r>
+              <w:rPr>
+                <w:sz w:val="20"/>
+                <w:szCs w:val="20"/>
+                <w:rtl w:val="0"/>
+              </w:rPr>
+              <w:t xml:space="preserve">Estruturação</w:t>
+            </w:r>
+            <w:r>
+              <w:rPr>
+                <w:rFonts w:ascii="Arial" w:cs="Arial" w:eastAsia="Arial" w:hAnsi="Arial"/>
+                <w:b w:val="0"/>
+                <w:bCs w:val="0"/>
+                <w:color w:val="000000"/>
+                <w:sz w:val="20"/>
+                <w:szCs w:val="20"/>
+                <w:rtl w:val="0"/>
+              </w:rPr>
+              <w:t xml:space="preserve"> acelerada com RAG (Retrieval-Augmented Generation): o que é, para que serve, quais os limites</w:t>
             </w:r>
             <w:r>
               <w:rPr>
@@ -13563,133 +13246,6 @@
                 <w:rtl w:val="0"/>
               </w:rPr>
               <w:t xml:space="preserve">8</w:t>
-            </w:r>
-            <w:r>
-              <w:rPr>
-                <w:rtl w:val="0"/>
-              </w:rPr>
-            </w:r>
-          </w:p>
-        </w:tc>
-        <w:tc>
-          <w:tcPr>
-            <w:tcBorders>
-              <w:top w:color="bfbfbf" w:space="0" w:sz="4" w:val="single"/>
-              <w:left w:color="bfbfbf" w:space="0" w:sz="4" w:val="single"/>
-              <w:bottom w:color="bfbfbf" w:space="0" w:sz="4" w:val="single"/>
-              <w:right w:color="bfbfbf" w:space="0" w:sz="4" w:val="single"/>
-            </w:tcBorders>
-            <w:tcMar>
-              <w:top w:w="100.0" w:type="dxa"/>
-              <w:left w:w="140.0" w:type="dxa"/>
-              <w:bottom w:w="100.0" w:type="dxa"/>
-              <w:right w:w="140.0" w:type="dxa"/>
-            </w:tcMar>
-          </w:tcPr>
-          <w:p>
-            <w:pPr>
-              <w:jc w:val="left"/>
-              <w:rPr/>
-            </w:pPr>
-            <w:r>
-              <w:rPr>
-                <w:rtl w:val="0"/>
-              </w:rPr>
-            </w:r>
-          </w:p>
-        </w:tc>
-        <w:tc>
-          <w:tcPr>
-            <w:tcBorders>
-              <w:top w:color="bfbfbf" w:space="0" w:sz="4" w:val="single"/>
-              <w:left w:color="bfbfbf" w:space="0" w:sz="4" w:val="single"/>
-              <w:bottom w:color="bfbfbf" w:space="0" w:sz="4" w:val="single"/>
-              <w:right w:color="bfbfbf" w:space="0" w:sz="4" w:val="single"/>
-            </w:tcBorders>
-            <w:tcMar>
-              <w:top w:w="100.0" w:type="dxa"/>
-              <w:left w:w="140.0" w:type="dxa"/>
-              <w:bottom w:w="100.0" w:type="dxa"/>
-              <w:right w:w="140.0" w:type="dxa"/>
-            </w:tcMar>
-          </w:tcPr>
-          <w:p>
-            <w:pPr>
-              <w:jc w:val="left"/>
-              <w:rPr/>
-            </w:pPr>
-            <w:r>
-              <w:rPr>
-                <w:rFonts w:ascii="Arial" w:cs="Arial" w:eastAsia="Arial" w:hAnsi="Arial"/>
-                <w:b w:val="0"/>
-                <w:bCs w:val="0"/>
-                <w:color w:val="000000"/>
-                <w:sz w:val="20"/>
-                <w:szCs w:val="20"/>
-                <w:rtl w:val="0"/>
-              </w:rPr>
-              <w:t xml:space="preserve">Etapa 3 com IA — </w:t>
-            </w:r>
-            <w:r>
-              <w:rPr>
-                <w:sz w:val="20"/>
-                <w:szCs w:val="20"/>
-                <w:rtl w:val="0"/>
-              </w:rPr>
-              <w:t xml:space="preserve">Estruturação</w:t>
-            </w:r>
-            <w:r>
-              <w:rPr>
-                <w:rFonts w:ascii="Arial" w:cs="Arial" w:eastAsia="Arial" w:hAnsi="Arial"/>
-                <w:b w:val="0"/>
-                <w:bCs w:val="0"/>
-                <w:color w:val="000000"/>
-                <w:sz w:val="20"/>
-                <w:szCs w:val="20"/>
-                <w:rtl w:val="0"/>
-              </w:rPr>
-              <w:t xml:space="preserve"> acelerada com RAG (Retrieval-Augmented Generation): o que é, para que serve, quais os limites</w:t>
-            </w:r>
-            <w:r>
-              <w:rPr>
-                <w:rtl w:val="0"/>
-              </w:rPr>
-            </w:r>
-          </w:p>
-        </w:tc>
-      </w:tr>
-      <w:tr>
-        <w:trPr>
-          <w:cantSplit w:val="0"/>
-          <w:tblHeader w:val="0"/>
-        </w:trPr>
-        <w:tc>
-          <w:tcPr>
-            <w:tcBorders>
-              <w:top w:color="bfbfbf" w:space="0" w:sz="4" w:val="single"/>
-              <w:left w:color="bfbfbf" w:space="0" w:sz="4" w:val="single"/>
-              <w:bottom w:color="bfbfbf" w:space="0" w:sz="4" w:val="single"/>
-              <w:right w:color="bfbfbf" w:space="0" w:sz="4" w:val="single"/>
-            </w:tcBorders>
-            <w:tcMar>
-              <w:top w:w="100.0" w:type="dxa"/>
-              <w:left w:w="140.0" w:type="dxa"/>
-              <w:bottom w:w="100.0" w:type="dxa"/>
-              <w:right w:w="140.0" w:type="dxa"/>
-            </w:tcMar>
-          </w:tcPr>
-          <w:p>
-            <w:pPr>
-              <w:jc w:val="center"/>
-              <w:rPr/>
-            </w:pPr>
-            <w:r>
-              <w:rPr>
-                <w:sz w:val="20"/>
-                <w:szCs w:val="20"/>
-                <w:rtl w:val="0"/>
-              </w:rPr>
-              <w:t xml:space="preserve">9</w:t>
             </w:r>
             <w:r>
               <w:rPr>

</xml_diff>